<commit_message>
Sign the letters as Ofir, redraw Steenmeijer's figures on 2022, drop duplicate figures, and add an origin by sector heat map
- Cover letter from Ofir Eriksen, lead author, with his affiliation; the
  response letter is signed by him too. Reference count corrected to 49.
- The co-author-design figures and the supplementary figures PDF are removed:
  they duplicated the submitted figures and carried matplotlib's default
  colours.
- r/plot_steenmeijer_variant_a.r also draws Steenmeijer et al.'s three figures
  on 2022c, with the article's labels and Paul Tol's muted palette; category
  labels are now plotmath with the article's line breaks, so CO2's subscript is
  drawn properly (variant a re-rendered).
- New r/plot_origin_sector_heatmap.r: 49 EXIOBASE countries and regions of
  production (plus "No region") by the twelve largest sector groups and a
  pooled remainder, one panel per impact category, binned YlOrRd shares.
- Readmes updated.
</commit_message>
<xml_diff>
--- a/docs/eriksen_et_al_2026/eriksen_et_al_2026_cover_letter.docx
+++ b/docs/eriksen_et_al_2026/eriksen_et_al_2026_cover_letter.docx
@@ -7,7 +7,25 @@
         <w:pStyle w:val="FirstParagraph"/>
       </w:pPr>
       <w:r>
-        <w:t xml:space="preserve">Ofir Eriksen and Albert Kwame Osei-Owusu</w:t>
+        <w:t xml:space="preserve">Ofir Eriksen</w:t>
+      </w:r>
+      <w:r>
+        <w:br/>
+      </w:r>
+      <w:r>
+        <w:t xml:space="preserve">Life Cycle Engineering, SDU Climate Cluster</w:t>
+      </w:r>
+      <w:r>
+        <w:br/>
+      </w:r>
+      <w:r>
+        <w:t xml:space="preserve">University of Southern Denmark</w:t>
+      </w:r>
+      <w:r>
+        <w:br/>
+      </w:r>
+      <w:r>
+        <w:t xml:space="preserve">ofe@igt.sdu.dk</w:t>
       </w:r>
     </w:p>
     <w:p>
@@ -427,7 +445,7 @@
         <w:pStyle w:val="BodyText"/>
       </w:pPr>
       <w:r>
-        <w:t xml:space="preserve">The manuscript is approximately 5,500 words of main text with three figures, one table and 47 references.</w:t>
+        <w:t xml:space="preserve">The manuscript is approximately 5,500 words of main text with three figures, one table and 49 references.</w:t>
       </w:r>
       <w:r>
         <w:t xml:space="preserve"> </w:t>
@@ -502,10 +520,10 @@
         <w:t xml:space="preserve">Ofir Eriksen</w:t>
       </w:r>
       <w:r>
-        <w:t xml:space="preserve"> </w:t>
-      </w:r>
-      <w:r>
-        <w:t xml:space="preserve">Albert Kwame Osei-Owusu</w:t>
+        <w:br/>
+      </w:r>
+      <w:r>
+        <w:t xml:space="preserve">Lead author, on behalf of all authors</w:t>
       </w:r>
     </w:p>
     <w:sectPr>

</xml_diff>